<commit_message>
Update binary documents in module 2 and 5 with new content
</commit_message>
<xml_diff>
--- a/2_Тайм менеджмент/Модуль 2/Модуль 2 Практичне завдання 2.docx
+++ b/2_Тайм менеджмент/Модуль 2/Модуль 2 Практичне завдання 2.docx
@@ -13916,7 +13916,7 @@
           </w:tcPr>
           <w:p>
             <w:r>
-              <w:t>12: –</w:t>
+              <w:t>12: +</w:t>
             </w:r>
           </w:p>
         </w:tc>
@@ -14010,7 +14010,7 @@
           </w:tcPr>
           <w:p>
             <w:r>
-              <w:t>24: +</w:t>
+              <w:t>24: –</w:t>
             </w:r>
           </w:p>
         </w:tc>
@@ -14104,7 +14104,7 @@
           </w:tcPr>
           <w:p>
             <w:r>
-              <w:t>36: –</w:t>
+              <w:t>36: +</w:t>
             </w:r>
           </w:p>
         </w:tc>
@@ -14289,7 +14289,7 @@
     </w:p>
     <w:p>
       <w:r>
-        <w:t>Зіставивши свої відповіді з «ключем», я отримав 15 збігів за комунікативною шкалою (Кх = 15) і 15 збігів за організаторською (Ох = 15). Звідси оціночні коефіцієнти:</w:t>
+        <w:t>Зіставивши свої відповіді з «ключем», я отримав 15 збігів за комунікативною шкалою (Кх = 15) і 14 збігів за організаторською (Ох = 14). Звідси оціночні коефіцієнти:</w:t>
       </w:r>
     </w:p>
     <w:p>
@@ -14299,12 +14299,12 @@
     </w:p>
     <w:p>
       <w:r>
-        <w:t>Ко = Ох / 20 = 15 / 20 = 0,75.</w:t>
+        <w:t>Ко = Ох / 20 = 14 / 20 = 0,70.</w:t>
       </w:r>
     </w:p>
     <w:p>
       <w:r>
-        <w:t>За шкалою оцінок коефіцієнт Кк = 0,75 потрапляє в діапазон 0,66–0,75, а Ко = 0,75 — у діапазон 0,71–0,80. Обом показникам відповідає шкальна оцінка «4», тобто високий рівень прояву і комунікативних, і організаторських схильностей.</w:t>
+        <w:t>За шкалою оцінок коефіцієнт Кк = 0,75 потрапляє в діапазон 0,66–0,75, що відповідає шкальній оцінці «4» — високий рівень комунікативних схильностей. Коефіцієнт Ко = 0,70 потрапляє в діапазон 0,66–0,70, тобто шкальна оцінка «3» — середній рівень організаторських схильностей.</w:t>
       </w:r>
     </w:p>
     <w:p>
@@ -14318,7 +14318,7 @@
     </w:p>
     <w:p>
       <w:r>
-        <w:t>Високий рівень за обома шкалами загалом збігається з моїм власним відчуттям себе і з характером роботи. Як бізнес-аналітик я щодня працюю на стику людей і завдань: збираю вимоги від замовників і команди, узгоджую суперечливі позиції, виступаю перед групою на демо та воркшопах. Тому не дивно, що в новій обстановці я не розгублююся, доволі легко встановлюю контакт із незнайомими людьми й людьми значно старшими за віком, без особливих зусиль можу оживити малознайому компанію та відстояти власну позицію, коли вважаю її обґрунтованою.</w:t>
+        <w:t>Високий рівень комунікативних схильностей загалом збігається з моїм власним відчуттям себе і з характером роботи. Як бізнес-аналітик я щодня працюю на стику людей і завдань: збираю вимоги від замовників і команди, узгоджую суперечливі позиції, виступаю перед групою на демо та воркшопах. Тому не дивно, що в новій обстановці я не розгублююся, доволі легко встановлюю контакт із незнайомими людьми й людьми значно старшими за віком, без особливих зусиль можу оживити малознайому компанію та відстояти власну позицію, коли вважаю її обґрунтованою.</w:t>
       </w:r>
     </w:p>
     <w:p>
@@ -14328,12 +14328,12 @@
     </w:p>
     <w:p>
       <w:r>
-        <w:t>Що стосується організаторських схильностей, то висока оцінка теж виглядає логічною: я не люблю залишати справи незавершеними, рідко відкладаю на потім те, що можна зробити сьогодні, і зазвичай беру ініціативу на себе, коли питання зачіпає спільний результат. Слабше місце — формальна «громадська» активність та організація суто розважальних заходів: тут мене тягне менше, і саме ці пункти трохи знизили підсумковий коефіцієнт.</w:t>
+        <w:t>Що стосується організаторських схильностей, то середня оцінка видається мені цілком чесною. З одного боку, я зазвичай беру ініціативу на себе, коли питання зачіпає спільний результат, і вмію організувати роботу навколо завдання. З іншого боку, особиста самоорганізація — радше моє слабке місце: я схильний відкладати справи на потім і часом запізнююся, тож пунктуальність і доведення дрібних задач до кінця даються мені складніше. Саме ці пункти, а також невелика тяга до суто формальної «громадської» активності, і знизили підсумковий коефіцієнт до середнього рівня.</w:t>
       </w:r>
     </w:p>
     <w:p>
       <w:r>
-        <w:t>Для тайм-менеджменту висновок для себе роблю такий: розвинені комунікативні й організаторські схильності — це ресурс, який варто свідомо спрямовувати. Високий рівень контактності означає, що до мене часто звертаються по допомогу й узгодження, а це з’їдає робочий час. Тому мені важливо поєднувати відкритість до людей із чіткими межами власного часу — планувати «вікна» для глибокої роботи й делегувати частину організаційних завдань, спираючись саме на ту ініціативність, яку показав тест.</w:t>
+        <w:t>Для тайм-менеджменту висновок для себе роблю такий: комунікативні схильності в мене розвинені, а організаторські — на середньому рівні, і саме над особистою самоорганізацією варто свідомо працювати. Висока контактність означає, що до мене часто звертаються по допомогу й узгодження, а це з’їдає робочий час. Тому мені важливо поєднувати відкритість до людей із чіткими межами власного часу — планувати «вікна» для глибокої роботи, боротися зі схильністю відкладати й делегувати частину організаційних завдань, спираючись на властиву мені ініціативність.</w:t>
       </w:r>
     </w:p>
     <w:sectPr>

</xml_diff>